<commit_message>
Aprovação Monteiro: Reduzir justificativa e manutenção objetivo
</commit_message>
<xml_diff>
--- a/TI/FlowIT.docx
+++ b/TI/FlowIT.docx
@@ -1,6 +1,6 @@
 
 <file path=word/document.xml><?xml version="1.0" encoding="utf-8"?>
-<w:document xmlns:wpc="http://schemas.microsoft.com/office/word/2010/wordprocessingCanvas" xmlns:cx="http://schemas.microsoft.com/office/drawing/2014/chartex" xmlns:cx1="http://schemas.microsoft.com/office/drawing/2015/9/8/chartex" xmlns:cx2="http://schemas.microsoft.com/office/drawing/2015/10/21/chartex" xmlns:cx3="http://schemas.microsoft.com/office/drawing/2016/5/9/chartex" xmlns:cx4="http://schemas.microsoft.com/office/drawing/2016/5/10/chartex" xmlns:cx5="http://schemas.microsoft.com/office/drawing/2016/5/11/chartex" xmlns:cx6="http://schemas.microsoft.com/office/drawing/2016/5/12/chartex" xmlns:cx7="http://schemas.microsoft.com/office/drawing/2016/5/13/chartex" xmlns:cx8="http://schemas.microsoft.com/office/drawing/2016/5/14/chartex" xmlns:mc="http://schemas.openxmlformats.org/markup-compatibility/2006" xmlns:aink="http://schemas.microsoft.com/office/drawing/2016/ink" xmlns:am3d="http://schemas.microsoft.com/office/drawing/2017/model3d" xmlns:o="urn:schemas-microsoft-com:office:office" xmlns:oel="http://schemas.microsoft.com/office/2019/extlst" xmlns:r="http://schemas.openxmlformats.org/officeDocument/2006/relationships" xmlns:m="http://schemas.openxmlformats.org/officeDocument/2006/math" xmlns:v="urn:schemas-microsoft-com:vml" xmlns:wp14="http://schemas.microsoft.com/office/word/2010/wordprocessingDrawing" xmlns:wp="http://schemas.openxmlformats.org/drawingml/2006/wordprocessingDrawing" xmlns:w10="urn:schemas-microsoft-com:office:word" xmlns:w="http://schemas.openxmlformats.org/wordprocessingml/2006/main" xmlns:w14="http://schemas.microsoft.com/office/word/2010/wordml" xmlns:w15="http://schemas.microsoft.com/office/word/2012/wordml" xmlns:w16cex="http://schemas.microsoft.com/office/word/2018/wordml/cex" xmlns:w16cid="http://schemas.microsoft.com/office/word/2016/wordml/cid" xmlns:w16="http://schemas.microsoft.com/office/word/2018/wordml" xmlns:w16sdtdh="http://schemas.microsoft.com/office/word/2020/wordml/sdtdatahash" xmlns:w16se="http://schemas.microsoft.com/office/word/2015/wordml/symex" xmlns:wpg="http://schemas.microsoft.com/office/word/2010/wordprocessingGroup" xmlns:wpi="http://schemas.microsoft.com/office/word/2010/wordprocessingInk" xmlns:wne="http://schemas.microsoft.com/office/word/2006/wordml" xmlns:wps="http://schemas.microsoft.com/office/word/2010/wordprocessingShape" mc:Ignorable="w14 w15 w16se w16cid w16 w16cex w16sdtdh wp14">
+<w:document xmlns:wpc="http://schemas.microsoft.com/office/word/2010/wordprocessingCanvas" xmlns:cx="http://schemas.microsoft.com/office/drawing/2014/chartex" xmlns:cx1="http://schemas.microsoft.com/office/drawing/2015/9/8/chartex" xmlns:cx2="http://schemas.microsoft.com/office/drawing/2015/10/21/chartex" xmlns:cx3="http://schemas.microsoft.com/office/drawing/2016/5/9/chartex" xmlns:cx4="http://schemas.microsoft.com/office/drawing/2016/5/10/chartex" xmlns:cx5="http://schemas.microsoft.com/office/drawing/2016/5/11/chartex" xmlns:cx6="http://schemas.microsoft.com/office/drawing/2016/5/12/chartex" xmlns:cx7="http://schemas.microsoft.com/office/drawing/2016/5/13/chartex" xmlns:cx8="http://schemas.microsoft.com/office/drawing/2016/5/14/chartex" xmlns:mc="http://schemas.openxmlformats.org/markup-compatibility/2006" xmlns:aink="http://schemas.microsoft.com/office/drawing/2016/ink" xmlns:am3d="http://schemas.microsoft.com/office/drawing/2017/model3d" xmlns:o="urn:schemas-microsoft-com:office:office" xmlns:oel="http://schemas.microsoft.com/office/2019/extlst" xmlns:r="http://schemas.openxmlformats.org/officeDocument/2006/relationships" xmlns:m="http://schemas.openxmlformats.org/officeDocument/2006/math" xmlns:v="urn:schemas-microsoft-com:vml" xmlns:wp14="http://schemas.microsoft.com/office/word/2010/wordprocessingDrawing" xmlns:wp="http://schemas.openxmlformats.org/drawingml/2006/wordprocessingDrawing" xmlns:w10="urn:schemas-microsoft-com:office:word" xmlns:w="http://schemas.openxmlformats.org/wordprocessingml/2006/main" xmlns:w14="http://schemas.microsoft.com/office/word/2010/wordml" xmlns:w15="http://schemas.microsoft.com/office/word/2012/wordml" xmlns:w16cex="http://schemas.microsoft.com/office/word/2018/wordml/cex" xmlns:w16cid="http://schemas.microsoft.com/office/word/2016/wordml/cid" xmlns:w16="http://schemas.microsoft.com/office/word/2018/wordml" xmlns:w16du="http://schemas.microsoft.com/office/word/2023/wordml/word16du" xmlns:w16sdtdh="http://schemas.microsoft.com/office/word/2020/wordml/sdtdatahash" xmlns:w16sdtfl="http://schemas.microsoft.com/office/word/2024/wordml/sdtformatlock" xmlns:w16se="http://schemas.microsoft.com/office/word/2015/wordml/symex" xmlns:wpg="http://schemas.microsoft.com/office/word/2010/wordprocessingGroup" xmlns:wpi="http://schemas.microsoft.com/office/word/2010/wordprocessingInk" xmlns:wne="http://schemas.microsoft.com/office/word/2006/wordml" xmlns:wps="http://schemas.microsoft.com/office/word/2010/wordprocessingShape" mc:Ignorable="w14 w15 w16se w16cid w16 w16cex w16sdtdh w16sdtfl w16du wp14">
   <w:body>
     <w:p>
       <w:pPr>
@@ -1572,11 +1572,9 @@
       <w:r>
         <w:t>Diante do contexto no qual o sistema está inserido, torna-se evidente como a escassez de tecnologias voltadas à análise do comportamento do cliente dentro das lojas impacta diretamente na experiência de compra e, consequentemente, nos resultados de vendas.</w:t>
       </w:r>
-    </w:p>
-    <w:p>
-      <w:pPr>
-        <w:ind w:firstLine="708"/>
-      </w:pPr>
+      <w:r>
+        <w:t xml:space="preserve"> </w:t>
+      </w:r>
       <w:r>
         <w:t>Um exemplo claro dessa realidade pode ser observado na Lojas Americanas, que, durante seu processo de crise envolvendo fraude contábil, apresentou diversos problemas operacionais, especialmente relacionados à organização dos ambientes físicos. Foram relatados corredores desorganizados, gôndolas vazias, filas extensas e falhas na reposição de produtos — fatores que comprometem significativamente a jornada do cliente.</w:t>
       </w:r>
@@ -1586,16 +1584,43 @@
         <w:ind w:firstLine="708"/>
       </w:pPr>
       <w:r>
-        <w:t>Nesse cenário, o sistema Flow surge como uma solução essencial, ao possibilitar o monitoramento preciso do fluxo de pessoas nos corredores da loja. A partir da coleta e análise desses dados, torna-se possível identificar falhas operacionais, mapear áreas de maior e menor circulação e compreender padrões de comportamento dos clientes.</w:t>
+        <w:t>Nesse cenário, o sistema</w:t>
+      </w:r>
+      <w:r>
+        <w:t xml:space="preserve"> Flow</w:t>
+      </w:r>
+      <w:r>
+        <w:t xml:space="preserve"> surge como uma solução essencial, ao possibilitar o monitoramento preciso do fluxo de pessoas nos corredores da loja. A partir da coleta e análise desses dados, torna-se possível identificar falhas operacionais, mapear áreas</w:t>
+      </w:r>
+      <w:r>
+        <w:t xml:space="preserve"> quentes</w:t>
+      </w:r>
+      <w:r>
+        <w:t xml:space="preserve"> e</w:t>
+      </w:r>
+      <w:r>
+        <w:t xml:space="preserve"> frias com base nos conceitos de trade marketing</w:t>
+      </w:r>
+      <w:r>
+        <w:t xml:space="preserve"> circulação e compreender padrões de comportamento dos clientes.</w:t>
+      </w:r>
+      <w:r>
+        <w:t xml:space="preserve"> </w:t>
+      </w:r>
+      <w:r>
+        <w:t xml:space="preserve">Com essas informações, a empresa pode tomar decisões mais assertivas, </w:t>
+      </w:r>
+      <w:r>
+        <w:t xml:space="preserve">a otimização do merchandising, </w:t>
+      </w:r>
+      <w:r>
+        <w:t>a qualidade do atendimento, resultando em uma experiência de compra mais eficiente e no aumento do desempenho das vendas.</w:t>
       </w:r>
     </w:p>
     <w:p>
       <w:pPr>
         <w:ind w:firstLine="708"/>
       </w:pPr>
-      <w:r>
-        <w:t>Com essas informações, a empresa pode tomar decisões mais assertivas, otimizando o layout, melhorando a reposição de produtos e elevando a qualidade do atendimento, resultando em uma experiência de compra mais eficiente e no aumento do desempenho das vendas.</w:t>
-      </w:r>
     </w:p>
     <w:p/>
     <w:p>
@@ -7305,7 +7330,6 @@
               <w:bottom w:val="single" w:sz="4" w:space="0" w:color="auto"/>
               <w:right w:val="single" w:sz="4" w:space="0" w:color="auto"/>
             </w:tcBorders>
-            <w:shd w:val="clear" w:color="auto" w:fill="auto"/>
             <w:noWrap/>
             <w:vAlign w:val="center"/>
             <w:hideMark/>
@@ -7348,7 +7372,6 @@
               <w:bottom w:val="single" w:sz="4" w:space="0" w:color="auto"/>
               <w:right w:val="single" w:sz="4" w:space="0" w:color="auto"/>
             </w:tcBorders>
-            <w:shd w:val="clear" w:color="auto" w:fill="auto"/>
             <w:vAlign w:val="center"/>
             <w:hideMark/>
           </w:tcPr>
@@ -7390,7 +7413,6 @@
               <w:bottom w:val="single" w:sz="4" w:space="0" w:color="auto"/>
               <w:right w:val="single" w:sz="4" w:space="0" w:color="auto"/>
             </w:tcBorders>
-            <w:shd w:val="clear" w:color="auto" w:fill="auto"/>
             <w:noWrap/>
             <w:vAlign w:val="center"/>
             <w:hideMark/>
@@ -7433,7 +7455,6 @@
               <w:bottom w:val="single" w:sz="4" w:space="0" w:color="auto"/>
               <w:right w:val="single" w:sz="4" w:space="0" w:color="auto"/>
             </w:tcBorders>
-            <w:shd w:val="clear" w:color="auto" w:fill="auto"/>
             <w:noWrap/>
             <w:vAlign w:val="center"/>
             <w:hideMark/>
@@ -7476,7 +7497,6 @@
               <w:bottom w:val="single" w:sz="4" w:space="0" w:color="auto"/>
               <w:right w:val="single" w:sz="4" w:space="0" w:color="auto"/>
             </w:tcBorders>
-            <w:shd w:val="clear" w:color="auto" w:fill="auto"/>
             <w:noWrap/>
             <w:vAlign w:val="center"/>
             <w:hideMark/>
@@ -7519,7 +7539,6 @@
               <w:bottom w:val="single" w:sz="4" w:space="0" w:color="auto"/>
               <w:right w:val="single" w:sz="4" w:space="0" w:color="auto"/>
             </w:tcBorders>
-            <w:shd w:val="clear" w:color="auto" w:fill="auto"/>
             <w:noWrap/>
             <w:vAlign w:val="center"/>
             <w:hideMark/>
@@ -7562,7 +7581,6 @@
               <w:bottom w:val="single" w:sz="4" w:space="0" w:color="auto"/>
               <w:right w:val="single" w:sz="8" w:space="0" w:color="000000"/>
             </w:tcBorders>
-            <w:shd w:val="clear" w:color="auto" w:fill="auto"/>
             <w:noWrap/>
             <w:vAlign w:val="center"/>
             <w:hideMark/>
@@ -7609,7 +7627,6 @@
               <w:bottom w:val="single" w:sz="4" w:space="0" w:color="auto"/>
               <w:right w:val="single" w:sz="4" w:space="0" w:color="auto"/>
             </w:tcBorders>
-            <w:shd w:val="clear" w:color="auto" w:fill="auto"/>
             <w:noWrap/>
             <w:vAlign w:val="center"/>
             <w:hideMark/>
@@ -7652,7 +7669,6 @@
               <w:bottom w:val="single" w:sz="4" w:space="0" w:color="auto"/>
               <w:right w:val="single" w:sz="4" w:space="0" w:color="auto"/>
             </w:tcBorders>
-            <w:shd w:val="clear" w:color="auto" w:fill="auto"/>
             <w:vAlign w:val="center"/>
             <w:hideMark/>
           </w:tcPr>
@@ -7720,7 +7736,6 @@
               <w:bottom w:val="single" w:sz="4" w:space="0" w:color="auto"/>
               <w:right w:val="single" w:sz="4" w:space="0" w:color="auto"/>
             </w:tcBorders>
-            <w:shd w:val="clear" w:color="auto" w:fill="auto"/>
             <w:noWrap/>
             <w:vAlign w:val="center"/>
             <w:hideMark/>
@@ -7763,7 +7778,6 @@
               <w:bottom w:val="single" w:sz="4" w:space="0" w:color="auto"/>
               <w:right w:val="single" w:sz="4" w:space="0" w:color="auto"/>
             </w:tcBorders>
-            <w:shd w:val="clear" w:color="auto" w:fill="auto"/>
             <w:noWrap/>
             <w:vAlign w:val="center"/>
             <w:hideMark/>
@@ -7806,7 +7820,6 @@
               <w:bottom w:val="single" w:sz="4" w:space="0" w:color="auto"/>
               <w:right w:val="single" w:sz="4" w:space="0" w:color="auto"/>
             </w:tcBorders>
-            <w:shd w:val="clear" w:color="auto" w:fill="auto"/>
             <w:noWrap/>
             <w:vAlign w:val="center"/>
             <w:hideMark/>
@@ -7849,7 +7862,6 @@
               <w:bottom w:val="single" w:sz="4" w:space="0" w:color="auto"/>
               <w:right w:val="single" w:sz="4" w:space="0" w:color="auto"/>
             </w:tcBorders>
-            <w:shd w:val="clear" w:color="auto" w:fill="auto"/>
             <w:noWrap/>
             <w:vAlign w:val="center"/>
             <w:hideMark/>
@@ -7892,7 +7904,6 @@
               <w:bottom w:val="single" w:sz="4" w:space="0" w:color="auto"/>
               <w:right w:val="single" w:sz="8" w:space="0" w:color="000000"/>
             </w:tcBorders>
-            <w:shd w:val="clear" w:color="auto" w:fill="auto"/>
             <w:vAlign w:val="center"/>
             <w:hideMark/>
           </w:tcPr>
@@ -7964,7 +7975,6 @@
               <w:bottom w:val="single" w:sz="4" w:space="0" w:color="auto"/>
               <w:right w:val="single" w:sz="4" w:space="0" w:color="auto"/>
             </w:tcBorders>
-            <w:shd w:val="clear" w:color="auto" w:fill="auto"/>
             <w:noWrap/>
             <w:vAlign w:val="center"/>
             <w:hideMark/>
@@ -8007,7 +8017,6 @@
               <w:bottom w:val="single" w:sz="4" w:space="0" w:color="auto"/>
               <w:right w:val="single" w:sz="4" w:space="0" w:color="auto"/>
             </w:tcBorders>
-            <w:shd w:val="clear" w:color="auto" w:fill="auto"/>
             <w:vAlign w:val="center"/>
             <w:hideMark/>
           </w:tcPr>
@@ -8049,7 +8058,6 @@
               <w:bottom w:val="single" w:sz="4" w:space="0" w:color="auto"/>
               <w:right w:val="single" w:sz="4" w:space="0" w:color="auto"/>
             </w:tcBorders>
-            <w:shd w:val="clear" w:color="auto" w:fill="auto"/>
             <w:noWrap/>
             <w:vAlign w:val="center"/>
             <w:hideMark/>
@@ -8092,7 +8100,6 @@
               <w:bottom w:val="single" w:sz="4" w:space="0" w:color="auto"/>
               <w:right w:val="single" w:sz="4" w:space="0" w:color="auto"/>
             </w:tcBorders>
-            <w:shd w:val="clear" w:color="auto" w:fill="auto"/>
             <w:noWrap/>
             <w:vAlign w:val="center"/>
             <w:hideMark/>
@@ -8135,7 +8142,6 @@
               <w:bottom w:val="single" w:sz="4" w:space="0" w:color="auto"/>
               <w:right w:val="single" w:sz="4" w:space="0" w:color="auto"/>
             </w:tcBorders>
-            <w:shd w:val="clear" w:color="auto" w:fill="auto"/>
             <w:noWrap/>
             <w:vAlign w:val="center"/>
             <w:hideMark/>
@@ -8178,7 +8184,6 @@
               <w:bottom w:val="single" w:sz="4" w:space="0" w:color="auto"/>
               <w:right w:val="single" w:sz="4" w:space="0" w:color="auto"/>
             </w:tcBorders>
-            <w:shd w:val="clear" w:color="auto" w:fill="auto"/>
             <w:noWrap/>
             <w:vAlign w:val="center"/>
             <w:hideMark/>
@@ -8221,7 +8226,6 @@
               <w:bottom w:val="single" w:sz="4" w:space="0" w:color="auto"/>
               <w:right w:val="single" w:sz="8" w:space="0" w:color="000000"/>
             </w:tcBorders>
-            <w:shd w:val="clear" w:color="auto" w:fill="auto"/>
             <w:vAlign w:val="center"/>
             <w:hideMark/>
           </w:tcPr>
@@ -8293,7 +8297,6 @@
               <w:bottom w:val="single" w:sz="4" w:space="0" w:color="auto"/>
               <w:right w:val="single" w:sz="4" w:space="0" w:color="auto"/>
             </w:tcBorders>
-            <w:shd w:val="clear" w:color="auto" w:fill="auto"/>
             <w:noWrap/>
             <w:vAlign w:val="center"/>
             <w:hideMark/>
@@ -8336,7 +8339,6 @@
               <w:bottom w:val="single" w:sz="4" w:space="0" w:color="auto"/>
               <w:right w:val="single" w:sz="4" w:space="0" w:color="auto"/>
             </w:tcBorders>
-            <w:shd w:val="clear" w:color="auto" w:fill="auto"/>
             <w:vAlign w:val="center"/>
             <w:hideMark/>
           </w:tcPr>
@@ -8378,7 +8380,6 @@
               <w:bottom w:val="single" w:sz="4" w:space="0" w:color="auto"/>
               <w:right w:val="single" w:sz="4" w:space="0" w:color="auto"/>
             </w:tcBorders>
-            <w:shd w:val="clear" w:color="auto" w:fill="auto"/>
             <w:noWrap/>
             <w:vAlign w:val="center"/>
             <w:hideMark/>
@@ -8421,7 +8422,6 @@
               <w:bottom w:val="single" w:sz="4" w:space="0" w:color="auto"/>
               <w:right w:val="single" w:sz="4" w:space="0" w:color="auto"/>
             </w:tcBorders>
-            <w:shd w:val="clear" w:color="auto" w:fill="auto"/>
             <w:noWrap/>
             <w:vAlign w:val="center"/>
             <w:hideMark/>
@@ -8464,7 +8464,6 @@
               <w:bottom w:val="single" w:sz="4" w:space="0" w:color="auto"/>
               <w:right w:val="single" w:sz="4" w:space="0" w:color="auto"/>
             </w:tcBorders>
-            <w:shd w:val="clear" w:color="auto" w:fill="auto"/>
             <w:noWrap/>
             <w:vAlign w:val="center"/>
             <w:hideMark/>
@@ -8507,7 +8506,6 @@
               <w:bottom w:val="single" w:sz="4" w:space="0" w:color="auto"/>
               <w:right w:val="single" w:sz="4" w:space="0" w:color="auto"/>
             </w:tcBorders>
-            <w:shd w:val="clear" w:color="auto" w:fill="auto"/>
             <w:noWrap/>
             <w:vAlign w:val="center"/>
             <w:hideMark/>
@@ -8550,7 +8548,6 @@
               <w:bottom w:val="single" w:sz="4" w:space="0" w:color="auto"/>
               <w:right w:val="single" w:sz="8" w:space="0" w:color="000000"/>
             </w:tcBorders>
-            <w:shd w:val="clear" w:color="auto" w:fill="auto"/>
             <w:vAlign w:val="center"/>
             <w:hideMark/>
           </w:tcPr>
@@ -8596,7 +8593,6 @@
               <w:bottom w:val="single" w:sz="4" w:space="0" w:color="auto"/>
               <w:right w:val="single" w:sz="4" w:space="0" w:color="auto"/>
             </w:tcBorders>
-            <w:shd w:val="clear" w:color="auto" w:fill="auto"/>
             <w:noWrap/>
             <w:vAlign w:val="center"/>
             <w:hideMark/>
@@ -8639,7 +8635,6 @@
               <w:bottom w:val="single" w:sz="4" w:space="0" w:color="auto"/>
               <w:right w:val="single" w:sz="4" w:space="0" w:color="auto"/>
             </w:tcBorders>
-            <w:shd w:val="clear" w:color="auto" w:fill="auto"/>
             <w:vAlign w:val="center"/>
             <w:hideMark/>
           </w:tcPr>
@@ -8681,7 +8676,6 @@
               <w:bottom w:val="single" w:sz="4" w:space="0" w:color="auto"/>
               <w:right w:val="single" w:sz="4" w:space="0" w:color="auto"/>
             </w:tcBorders>
-            <w:shd w:val="clear" w:color="auto" w:fill="auto"/>
             <w:noWrap/>
             <w:vAlign w:val="center"/>
             <w:hideMark/>
@@ -8724,7 +8718,6 @@
               <w:bottom w:val="single" w:sz="4" w:space="0" w:color="auto"/>
               <w:right w:val="single" w:sz="4" w:space="0" w:color="auto"/>
             </w:tcBorders>
-            <w:shd w:val="clear" w:color="auto" w:fill="auto"/>
             <w:noWrap/>
             <w:vAlign w:val="center"/>
             <w:hideMark/>
@@ -8767,7 +8760,6 @@
               <w:bottom w:val="single" w:sz="4" w:space="0" w:color="auto"/>
               <w:right w:val="single" w:sz="4" w:space="0" w:color="auto"/>
             </w:tcBorders>
-            <w:shd w:val="clear" w:color="auto" w:fill="auto"/>
             <w:noWrap/>
             <w:vAlign w:val="center"/>
             <w:hideMark/>
@@ -8810,7 +8802,6 @@
               <w:bottom w:val="single" w:sz="4" w:space="0" w:color="auto"/>
               <w:right w:val="single" w:sz="4" w:space="0" w:color="auto"/>
             </w:tcBorders>
-            <w:shd w:val="clear" w:color="auto" w:fill="auto"/>
             <w:noWrap/>
             <w:vAlign w:val="center"/>
             <w:hideMark/>
@@ -8853,7 +8844,6 @@
               <w:bottom w:val="single" w:sz="4" w:space="0" w:color="auto"/>
               <w:right w:val="single" w:sz="8" w:space="0" w:color="000000"/>
             </w:tcBorders>
-            <w:shd w:val="clear" w:color="auto" w:fill="auto"/>
             <w:noWrap/>
             <w:vAlign w:val="center"/>
             <w:hideMark/>
@@ -8900,7 +8890,6 @@
               <w:bottom w:val="single" w:sz="4" w:space="0" w:color="auto"/>
               <w:right w:val="single" w:sz="4" w:space="0" w:color="auto"/>
             </w:tcBorders>
-            <w:shd w:val="clear" w:color="auto" w:fill="auto"/>
             <w:noWrap/>
             <w:vAlign w:val="center"/>
             <w:hideMark/>
@@ -8943,7 +8932,6 @@
               <w:bottom w:val="single" w:sz="4" w:space="0" w:color="auto"/>
               <w:right w:val="single" w:sz="4" w:space="0" w:color="auto"/>
             </w:tcBorders>
-            <w:shd w:val="clear" w:color="auto" w:fill="auto"/>
             <w:vAlign w:val="center"/>
             <w:hideMark/>
           </w:tcPr>
@@ -9011,7 +8999,6 @@
               <w:bottom w:val="single" w:sz="4" w:space="0" w:color="auto"/>
               <w:right w:val="single" w:sz="4" w:space="0" w:color="auto"/>
             </w:tcBorders>
-            <w:shd w:val="clear" w:color="auto" w:fill="auto"/>
             <w:noWrap/>
             <w:vAlign w:val="center"/>
             <w:hideMark/>
@@ -9054,7 +9041,6 @@
               <w:bottom w:val="single" w:sz="4" w:space="0" w:color="auto"/>
               <w:right w:val="single" w:sz="4" w:space="0" w:color="auto"/>
             </w:tcBorders>
-            <w:shd w:val="clear" w:color="auto" w:fill="auto"/>
             <w:noWrap/>
             <w:vAlign w:val="center"/>
             <w:hideMark/>
@@ -9097,7 +9083,6 @@
               <w:bottom w:val="single" w:sz="4" w:space="0" w:color="auto"/>
               <w:right w:val="single" w:sz="4" w:space="0" w:color="auto"/>
             </w:tcBorders>
-            <w:shd w:val="clear" w:color="auto" w:fill="auto"/>
             <w:noWrap/>
             <w:vAlign w:val="center"/>
             <w:hideMark/>
@@ -9140,7 +9125,6 @@
               <w:bottom w:val="single" w:sz="4" w:space="0" w:color="auto"/>
               <w:right w:val="single" w:sz="4" w:space="0" w:color="auto"/>
             </w:tcBorders>
-            <w:shd w:val="clear" w:color="auto" w:fill="auto"/>
             <w:noWrap/>
             <w:vAlign w:val="center"/>
             <w:hideMark/>
@@ -9183,7 +9167,6 @@
               <w:bottom w:val="single" w:sz="4" w:space="0" w:color="auto"/>
               <w:right w:val="single" w:sz="8" w:space="0" w:color="000000"/>
             </w:tcBorders>
-            <w:shd w:val="clear" w:color="auto" w:fill="auto"/>
             <w:vAlign w:val="center"/>
             <w:hideMark/>
           </w:tcPr>
@@ -9229,7 +9212,6 @@
               <w:bottom w:val="single" w:sz="4" w:space="0" w:color="auto"/>
               <w:right w:val="single" w:sz="4" w:space="0" w:color="auto"/>
             </w:tcBorders>
-            <w:shd w:val="clear" w:color="auto" w:fill="auto"/>
             <w:noWrap/>
             <w:vAlign w:val="center"/>
             <w:hideMark/>
@@ -9272,7 +9254,6 @@
               <w:bottom w:val="single" w:sz="4" w:space="0" w:color="auto"/>
               <w:right w:val="single" w:sz="4" w:space="0" w:color="auto"/>
             </w:tcBorders>
-            <w:shd w:val="clear" w:color="auto" w:fill="auto"/>
             <w:vAlign w:val="center"/>
             <w:hideMark/>
           </w:tcPr>
@@ -9314,7 +9295,6 @@
               <w:bottom w:val="single" w:sz="4" w:space="0" w:color="auto"/>
               <w:right w:val="single" w:sz="4" w:space="0" w:color="auto"/>
             </w:tcBorders>
-            <w:shd w:val="clear" w:color="auto" w:fill="auto"/>
             <w:noWrap/>
             <w:vAlign w:val="center"/>
             <w:hideMark/>
@@ -9357,7 +9337,6 @@
               <w:bottom w:val="single" w:sz="4" w:space="0" w:color="auto"/>
               <w:right w:val="single" w:sz="4" w:space="0" w:color="auto"/>
             </w:tcBorders>
-            <w:shd w:val="clear" w:color="auto" w:fill="auto"/>
             <w:noWrap/>
             <w:vAlign w:val="center"/>
             <w:hideMark/>
@@ -9400,7 +9379,6 @@
               <w:bottom w:val="single" w:sz="4" w:space="0" w:color="auto"/>
               <w:right w:val="single" w:sz="4" w:space="0" w:color="auto"/>
             </w:tcBorders>
-            <w:shd w:val="clear" w:color="auto" w:fill="auto"/>
             <w:noWrap/>
             <w:vAlign w:val="center"/>
             <w:hideMark/>
@@ -9443,7 +9421,6 @@
               <w:bottom w:val="single" w:sz="4" w:space="0" w:color="auto"/>
               <w:right w:val="single" w:sz="4" w:space="0" w:color="auto"/>
             </w:tcBorders>
-            <w:shd w:val="clear" w:color="auto" w:fill="auto"/>
             <w:noWrap/>
             <w:vAlign w:val="center"/>
             <w:hideMark/>
@@ -9486,7 +9463,6 @@
               <w:bottom w:val="single" w:sz="4" w:space="0" w:color="auto"/>
               <w:right w:val="single" w:sz="8" w:space="0" w:color="000000"/>
             </w:tcBorders>
-            <w:shd w:val="clear" w:color="auto" w:fill="auto"/>
             <w:vAlign w:val="center"/>
             <w:hideMark/>
           </w:tcPr>
@@ -9532,7 +9508,6 @@
               <w:bottom w:val="single" w:sz="8" w:space="0" w:color="auto"/>
               <w:right w:val="single" w:sz="4" w:space="0" w:color="auto"/>
             </w:tcBorders>
-            <w:shd w:val="clear" w:color="auto" w:fill="auto"/>
             <w:noWrap/>
             <w:vAlign w:val="center"/>
             <w:hideMark/>
@@ -9575,7 +9550,6 @@
               <w:bottom w:val="single" w:sz="8" w:space="0" w:color="auto"/>
               <w:right w:val="single" w:sz="4" w:space="0" w:color="auto"/>
             </w:tcBorders>
-            <w:shd w:val="clear" w:color="auto" w:fill="auto"/>
             <w:vAlign w:val="center"/>
             <w:hideMark/>
           </w:tcPr>
@@ -9617,7 +9591,6 @@
               <w:bottom w:val="single" w:sz="8" w:space="0" w:color="auto"/>
               <w:right w:val="single" w:sz="4" w:space="0" w:color="auto"/>
             </w:tcBorders>
-            <w:shd w:val="clear" w:color="auto" w:fill="auto"/>
             <w:noWrap/>
             <w:vAlign w:val="center"/>
             <w:hideMark/>
@@ -9660,7 +9633,6 @@
               <w:bottom w:val="single" w:sz="8" w:space="0" w:color="auto"/>
               <w:right w:val="single" w:sz="4" w:space="0" w:color="auto"/>
             </w:tcBorders>
-            <w:shd w:val="clear" w:color="auto" w:fill="auto"/>
             <w:noWrap/>
             <w:vAlign w:val="center"/>
             <w:hideMark/>
@@ -9703,7 +9675,6 @@
               <w:bottom w:val="single" w:sz="8" w:space="0" w:color="auto"/>
               <w:right w:val="single" w:sz="4" w:space="0" w:color="auto"/>
             </w:tcBorders>
-            <w:shd w:val="clear" w:color="auto" w:fill="auto"/>
             <w:noWrap/>
             <w:vAlign w:val="center"/>
             <w:hideMark/>
@@ -9746,7 +9717,6 @@
               <w:bottom w:val="single" w:sz="8" w:space="0" w:color="auto"/>
               <w:right w:val="single" w:sz="4" w:space="0" w:color="auto"/>
             </w:tcBorders>
-            <w:shd w:val="clear" w:color="auto" w:fill="auto"/>
             <w:noWrap/>
             <w:vAlign w:val="center"/>
             <w:hideMark/>
@@ -9789,7 +9759,6 @@
               <w:bottom w:val="single" w:sz="8" w:space="0" w:color="auto"/>
               <w:right w:val="single" w:sz="8" w:space="0" w:color="000000"/>
             </w:tcBorders>
-            <w:shd w:val="clear" w:color="auto" w:fill="auto"/>
             <w:vAlign w:val="center"/>
             <w:hideMark/>
           </w:tcPr>
@@ -10023,7 +9992,7 @@
 </file>
 
 <file path=word/numbering.xml><?xml version="1.0" encoding="utf-8"?>
-<w:numbering xmlns:wpc="http://schemas.microsoft.com/office/word/2010/wordprocessingCanvas" xmlns:cx="http://schemas.microsoft.com/office/drawing/2014/chartex" xmlns:cx1="http://schemas.microsoft.com/office/drawing/2015/9/8/chartex" xmlns:cx2="http://schemas.microsoft.com/office/drawing/2015/10/21/chartex" xmlns:cx3="http://schemas.microsoft.com/office/drawing/2016/5/9/chartex" xmlns:cx4="http://schemas.microsoft.com/office/drawing/2016/5/10/chartex" xmlns:cx5="http://schemas.microsoft.com/office/drawing/2016/5/11/chartex" xmlns:cx6="http://schemas.microsoft.com/office/drawing/2016/5/12/chartex" xmlns:cx7="http://schemas.microsoft.com/office/drawing/2016/5/13/chartex" xmlns:cx8="http://schemas.microsoft.com/office/drawing/2016/5/14/chartex" xmlns:mc="http://schemas.openxmlformats.org/markup-compatibility/2006" xmlns:aink="http://schemas.microsoft.com/office/drawing/2016/ink" xmlns:am3d="http://schemas.microsoft.com/office/drawing/2017/model3d" xmlns:o="urn:schemas-microsoft-com:office:office" xmlns:oel="http://schemas.microsoft.com/office/2019/extlst" xmlns:r="http://schemas.openxmlformats.org/officeDocument/2006/relationships" xmlns:m="http://schemas.openxmlformats.org/officeDocument/2006/math" xmlns:v="urn:schemas-microsoft-com:vml" xmlns:wp14="http://schemas.microsoft.com/office/word/2010/wordprocessingDrawing" xmlns:wp="http://schemas.openxmlformats.org/drawingml/2006/wordprocessingDrawing" xmlns:w10="urn:schemas-microsoft-com:office:word" xmlns:w="http://schemas.openxmlformats.org/wordprocessingml/2006/main" xmlns:w14="http://schemas.microsoft.com/office/word/2010/wordml" xmlns:w15="http://schemas.microsoft.com/office/word/2012/wordml" xmlns:w16cex="http://schemas.microsoft.com/office/word/2018/wordml/cex" xmlns:w16cid="http://schemas.microsoft.com/office/word/2016/wordml/cid" xmlns:w16="http://schemas.microsoft.com/office/word/2018/wordml" xmlns:w16sdtdh="http://schemas.microsoft.com/office/word/2020/wordml/sdtdatahash" xmlns:w16se="http://schemas.microsoft.com/office/word/2015/wordml/symex" xmlns:wpg="http://schemas.microsoft.com/office/word/2010/wordprocessingGroup" xmlns:wpi="http://schemas.microsoft.com/office/word/2010/wordprocessingInk" xmlns:wne="http://schemas.microsoft.com/office/word/2006/wordml" xmlns:wps="http://schemas.microsoft.com/office/word/2010/wordprocessingShape" mc:Ignorable="w14 w15 w16se w16cid w16 w16cex w16sdtdh wp14">
+<w:numbering xmlns:wpc="http://schemas.microsoft.com/office/word/2010/wordprocessingCanvas" xmlns:cx="http://schemas.microsoft.com/office/drawing/2014/chartex" xmlns:cx1="http://schemas.microsoft.com/office/drawing/2015/9/8/chartex" xmlns:cx2="http://schemas.microsoft.com/office/drawing/2015/10/21/chartex" xmlns:cx3="http://schemas.microsoft.com/office/drawing/2016/5/9/chartex" xmlns:cx4="http://schemas.microsoft.com/office/drawing/2016/5/10/chartex" xmlns:cx5="http://schemas.microsoft.com/office/drawing/2016/5/11/chartex" xmlns:cx6="http://schemas.microsoft.com/office/drawing/2016/5/12/chartex" xmlns:cx7="http://schemas.microsoft.com/office/drawing/2016/5/13/chartex" xmlns:cx8="http://schemas.microsoft.com/office/drawing/2016/5/14/chartex" xmlns:mc="http://schemas.openxmlformats.org/markup-compatibility/2006" xmlns:aink="http://schemas.microsoft.com/office/drawing/2016/ink" xmlns:am3d="http://schemas.microsoft.com/office/drawing/2017/model3d" xmlns:o="urn:schemas-microsoft-com:office:office" xmlns:oel="http://schemas.microsoft.com/office/2019/extlst" xmlns:r="http://schemas.openxmlformats.org/officeDocument/2006/relationships" xmlns:m="http://schemas.openxmlformats.org/officeDocument/2006/math" xmlns:v="urn:schemas-microsoft-com:vml" xmlns:wp14="http://schemas.microsoft.com/office/word/2010/wordprocessingDrawing" xmlns:wp="http://schemas.openxmlformats.org/drawingml/2006/wordprocessingDrawing" xmlns:w10="urn:schemas-microsoft-com:office:word" xmlns:w="http://schemas.openxmlformats.org/wordprocessingml/2006/main" xmlns:w14="http://schemas.microsoft.com/office/word/2010/wordml" xmlns:w15="http://schemas.microsoft.com/office/word/2012/wordml" xmlns:w16cex="http://schemas.microsoft.com/office/word/2018/wordml/cex" xmlns:w16cid="http://schemas.microsoft.com/office/word/2016/wordml/cid" xmlns:w16="http://schemas.microsoft.com/office/word/2018/wordml" xmlns:w16du="http://schemas.microsoft.com/office/word/2023/wordml/word16du" xmlns:w16sdtdh="http://schemas.microsoft.com/office/word/2020/wordml/sdtdatahash" xmlns:w16sdtfl="http://schemas.microsoft.com/office/word/2024/wordml/sdtformatlock" xmlns:w16se="http://schemas.microsoft.com/office/word/2015/wordml/symex" xmlns:wpg="http://schemas.microsoft.com/office/word/2010/wordprocessingGroup" xmlns:wpi="http://schemas.microsoft.com/office/word/2010/wordprocessingInk" xmlns:wne="http://schemas.microsoft.com/office/word/2006/wordml" xmlns:wps="http://schemas.microsoft.com/office/word/2010/wordprocessingShape" mc:Ignorable="w14 w15 w16se w16cid w16 w16cex w16sdtdh w16sdtfl w16du wp14">
   <w:abstractNum w:abstractNumId="0" w15:restartNumberingAfterBreak="0">
     <w:nsid w:val="09F063C8"/>
     <w:multiLevelType w:val="multilevel"/>
@@ -11071,7 +11040,7 @@
 </file>
 
 <file path=word/styles.xml><?xml version="1.0" encoding="utf-8"?>
-<w:styles xmlns:mc="http://schemas.openxmlformats.org/markup-compatibility/2006" xmlns:r="http://schemas.openxmlformats.org/officeDocument/2006/relationships" xmlns:w="http://schemas.openxmlformats.org/wordprocessingml/2006/main" xmlns:w14="http://schemas.microsoft.com/office/word/2010/wordml" xmlns:w15="http://schemas.microsoft.com/office/word/2012/wordml" xmlns:w16cex="http://schemas.microsoft.com/office/word/2018/wordml/cex" xmlns:w16cid="http://schemas.microsoft.com/office/word/2016/wordml/cid" xmlns:w16="http://schemas.microsoft.com/office/word/2018/wordml" xmlns:w16sdtdh="http://schemas.microsoft.com/office/word/2020/wordml/sdtdatahash" xmlns:w16se="http://schemas.microsoft.com/office/word/2015/wordml/symex" mc:Ignorable="w14 w15 w16se w16cid w16 w16cex w16sdtdh">
+<w:styles xmlns:mc="http://schemas.openxmlformats.org/markup-compatibility/2006" xmlns:r="http://schemas.openxmlformats.org/officeDocument/2006/relationships" xmlns:w="http://schemas.openxmlformats.org/wordprocessingml/2006/main" xmlns:w14="http://schemas.microsoft.com/office/word/2010/wordml" xmlns:w15="http://schemas.microsoft.com/office/word/2012/wordml" xmlns:w16cex="http://schemas.microsoft.com/office/word/2018/wordml/cex" xmlns:w16cid="http://schemas.microsoft.com/office/word/2016/wordml/cid" xmlns:w16="http://schemas.microsoft.com/office/word/2018/wordml" xmlns:w16du="http://schemas.microsoft.com/office/word/2023/wordml/word16du" xmlns:w16sdtdh="http://schemas.microsoft.com/office/word/2020/wordml/sdtdatahash" xmlns:w16sdtfl="http://schemas.microsoft.com/office/word/2024/wordml/sdtformatlock" xmlns:w16se="http://schemas.microsoft.com/office/word/2015/wordml/symex" mc:Ignorable="w14 w15 w16se w16cid w16 w16cex w16sdtdh w16sdtfl w16du">
   <w:docDefaults>
     <w:rPrDefault>
       <w:rPr>

</xml_diff>